<commit_message>
more work on final report
</commit_message>
<xml_diff>
--- a/Final_Report/Tyler_Contributions.docx
+++ b/Final_Report/Tyler_Contributions.docx
@@ -40,96 +40,26 @@
         <w:rPr>
           <w:rFonts w:ascii="Times New Roman" w:hAnsi="Times New Roman" w:cs="Times New Roman"/>
         </w:rPr>
-        <w:t>To program the device, first turn the power on using the hard kill switch. Ensure the push toggle remains off (out). Connect to the device on the mobile app by pressing the “connect device” button. If connection is successful, the button will read “Connected” and turn green. During device selection on the mobile app, choose the device labeled “</w:t>
-      </w:r>
-      <w:proofErr w:type="spellStart"/>
-      <w:r>
-        <w:rPr>
-          <w:rFonts w:ascii="Times New Roman" w:hAnsi="Times New Roman" w:cs="Times New Roman"/>
-        </w:rPr>
-        <w:t>mpy-uart</w:t>
-      </w:r>
-      <w:proofErr w:type="spellEnd"/>
-      <w:r>
-        <w:rPr>
-          <w:rFonts w:ascii="Times New Roman" w:hAnsi="Times New Roman" w:cs="Times New Roman"/>
-        </w:rPr>
-        <w:t xml:space="preserve">.” Once connected to the device, use the text boxes to select the desired channel frequencies. All channels are in units of hertz. As frequencies are chosen, beat frequencies will be calculated automatically and displayed on screen. Once all desired frequencies are present, press the “Program Device” button and wait for control to return. All frequencies programmed the device are written out to nonvolatile </w:t>
-      </w:r>
-      <w:proofErr w:type="gramStart"/>
-      <w:r>
-        <w:rPr>
-          <w:rFonts w:ascii="Times New Roman" w:hAnsi="Times New Roman" w:cs="Times New Roman"/>
-        </w:rPr>
-        <w:t>memory, and</w:t>
-      </w:r>
-      <w:proofErr w:type="gramEnd"/>
-      <w:r>
-        <w:rPr>
-          <w:rFonts w:ascii="Times New Roman" w:hAnsi="Times New Roman" w:cs="Times New Roman"/>
-        </w:rPr>
-        <w:t xml:space="preserve"> should persist between power cycles. At the completion of programming, the device is ready to generate stimulus.</w:t>
-      </w:r>
-    </w:p>
-    <w:p>
-      <w:pPr>
-        <w:rPr>
-          <w:rFonts w:ascii="Times New Roman" w:hAnsi="Times New Roman" w:cs="Times New Roman"/>
-        </w:rPr>
-      </w:pPr>
-      <w:r>
-        <w:rPr>
-          <w:rFonts w:ascii="Times New Roman" w:hAnsi="Times New Roman" w:cs="Times New Roman"/>
-        </w:rPr>
-        <w:t xml:space="preserve">To begin stimulus generation, ensure the device has been powered on using the hard kill switch, and then press and release the soft kill toggle button. It will latch in to show the stimulus is on. Once the stimulus has been turned on, it will ramp the output over a few seconds. There is </w:t>
-      </w:r>
-      <w:proofErr w:type="gramStart"/>
-      <w:r>
-        <w:rPr>
-          <w:rFonts w:ascii="Times New Roman" w:hAnsi="Times New Roman" w:cs="Times New Roman"/>
-        </w:rPr>
-        <w:t>not currently</w:t>
-      </w:r>
-      <w:proofErr w:type="gramEnd"/>
-      <w:r>
-        <w:rPr>
-          <w:rFonts w:ascii="Times New Roman" w:hAnsi="Times New Roman" w:cs="Times New Roman"/>
-        </w:rPr>
-        <w:t xml:space="preserve"> functionality for selecting amplitude on the mobile app, and it will be </w:t>
-      </w:r>
-      <w:proofErr w:type="gramStart"/>
-      <w:r>
-        <w:rPr>
-          <w:rFonts w:ascii="Times New Roman" w:hAnsi="Times New Roman" w:cs="Times New Roman"/>
-        </w:rPr>
-        <w:t>hard-coded</w:t>
-      </w:r>
-      <w:proofErr w:type="gramEnd"/>
-      <w:r>
-        <w:rPr>
-          <w:rFonts w:ascii="Times New Roman" w:hAnsi="Times New Roman" w:cs="Times New Roman"/>
-        </w:rPr>
-        <w:t xml:space="preserve"> into the software. Future releases should address this problem.</w:t>
-      </w:r>
-      <w:r>
-        <w:rPr>
-          <w:rFonts w:ascii="Times New Roman" w:hAnsi="Times New Roman" w:cs="Times New Roman"/>
-        </w:rPr>
-        <w:t xml:space="preserve"> To stop stimulation, press and release the soft kill switch again, causing the stimulus to ramp down over a few seconds back to zero. In the case of emergency, </w:t>
-      </w:r>
-      <w:proofErr w:type="gramStart"/>
-      <w:r>
-        <w:rPr>
-          <w:rFonts w:ascii="Times New Roman" w:hAnsi="Times New Roman" w:cs="Times New Roman"/>
-        </w:rPr>
-        <w:t>instead  cut</w:t>
-      </w:r>
-      <w:proofErr w:type="gramEnd"/>
-      <w:r>
-        <w:rPr>
-          <w:rFonts w:ascii="Times New Roman" w:hAnsi="Times New Roman" w:cs="Times New Roman"/>
-        </w:rPr>
-        <w:t xml:space="preserve"> power using the hard kill switch. Note that a hard kill while stimulus is active may cause pain or discomfort to the patient.</w:t>
+        <w:t>To program the device, first turn the power on using the hard kill switch. Ensure the push toggle remains off (out). Connect to the device on the mobile app by pressing the “connect device” button. If connection is successful, the button will read “Connected” and turn green. During device selection on the mobile app, choose the device labeled “mpy-uart.” Once connected to the device, use the text boxes to select the desired channel frequencies. All channels are in units of hertz. As frequencies are chosen, beat frequencies will be calculated automatically and displayed on screen. Once all desired frequencies are present, press the “Program Device” button and wait for control to return. All frequencies programmed the device are written out to nonvolatile memory, and should persist between power cycles. At the completion of programming, the device is ready to generate stimulus.</w:t>
+      </w:r>
+    </w:p>
+    <w:p>
+      <w:pPr>
+        <w:rPr>
+          <w:rFonts w:ascii="Times New Roman" w:hAnsi="Times New Roman" w:cs="Times New Roman"/>
+        </w:rPr>
+      </w:pPr>
+      <w:r>
+        <w:rPr>
+          <w:rFonts w:ascii="Times New Roman" w:hAnsi="Times New Roman" w:cs="Times New Roman"/>
+        </w:rPr>
+        <w:t>To begin stimulus generation, ensure the device has been powered on using the hard kill switch, and then press and release the soft kill toggle button. It will latch in to show the stimulus is on. Once the stimulus has been turned on, it will ramp the output over a few seconds. There is not currently functionality for selecting amplitude on the mobile app, and it will be hard-coded into the software. Future releases should address this problem.</w:t>
+      </w:r>
+      <w:r>
+        <w:rPr>
+          <w:rFonts w:ascii="Times New Roman" w:hAnsi="Times New Roman" w:cs="Times New Roman"/>
+        </w:rPr>
+        <w:t xml:space="preserve"> To stop stimulation, press and release the soft kill switch again, causing the stimulus to ramp down over a few seconds back to zero. In the case of emergency, instead  cut power using the hard kill switch. Note that a hard kill while stimulus is active may cause pain or discomfort to the patient.</w:t>
       </w:r>
     </w:p>
     <w:p>
@@ -183,21 +113,7 @@
         <w:rPr>
           <w:rFonts w:ascii="Times New Roman" w:hAnsi="Times New Roman" w:cs="Times New Roman"/>
         </w:rPr>
-        <w:t xml:space="preserve">The main concerns for hardware selection are isolation, power dissipation, and max ratings. The output loops consist of a transformer, which is large to be tolerant up to 0.15 W power, and feedback ADCs. These ADCs isolate the analog and digital domains and are powered from an isolating 3.3 V supply so that the output loop does not reference to on board ground. This is done for signal integrity. The voltage feeding into these ADCs is over </w:t>
-      </w:r>
-      <w:proofErr w:type="gramStart"/>
-      <w:r>
-        <w:rPr>
-          <w:rFonts w:ascii="Times New Roman" w:hAnsi="Times New Roman" w:cs="Times New Roman"/>
-        </w:rPr>
-        <w:t>10 ohm</w:t>
-      </w:r>
-      <w:proofErr w:type="gramEnd"/>
-      <w:r>
-        <w:rPr>
-          <w:rFonts w:ascii="Times New Roman" w:hAnsi="Times New Roman" w:cs="Times New Roman"/>
-        </w:rPr>
-        <w:t xml:space="preserve"> resistors, which have been sourced to be tolerant to up to 1 W.</w:t>
+        <w:t>The main concerns for hardware selection are isolation, power dissipation, and max ratings. The output loops consist of a transformer, which is large to be tolerant up to 0.15 W power, and feedback ADCs. These ADCs isolate the analog and digital domains and are powered from an isolating 3.3 V supply so that the output loop does not reference to on board ground. This is done for signal integrity. The voltage feeding into these ADCs is over 10 ohm resistors, which have been sourced to be tolerant to up to 1 W.</w:t>
       </w:r>
     </w:p>
     <w:p>
@@ -211,117 +127,33 @@
           <w:rFonts w:ascii="Times New Roman" w:hAnsi="Times New Roman" w:cs="Times New Roman"/>
         </w:rPr>
         <w:lastRenderedPageBreak/>
-        <w:t xml:space="preserve">Feeding into the output transformers are voltage controlled current sources consisting of two op-amps. These step up from the 5 V domain to the 30 V domain, and so are tolerant of input voltages well over 30 V. Resistors for these op-amps again need to be rated for very </w:t>
-      </w:r>
-      <w:proofErr w:type="gramStart"/>
-      <w:r>
-        <w:rPr>
-          <w:rFonts w:ascii="Times New Roman" w:hAnsi="Times New Roman" w:cs="Times New Roman"/>
-        </w:rPr>
-        <w:t>high power</w:t>
-      </w:r>
-      <w:proofErr w:type="gramEnd"/>
-      <w:r>
-        <w:rPr>
-          <w:rFonts w:ascii="Times New Roman" w:hAnsi="Times New Roman" w:cs="Times New Roman"/>
-        </w:rPr>
-        <w:t xml:space="preserve"> dissipation because current will be forced. Amplification stages leading into the current source consist of programmable resistor dividers feeding into buffers, which ensures signal fidelity and allows an easy way to control attenuation from the microcontroller. The source of sine wave generation is </w:t>
-      </w:r>
-      <w:proofErr w:type="gramStart"/>
-      <w:r>
-        <w:rPr>
-          <w:rFonts w:ascii="Times New Roman" w:hAnsi="Times New Roman" w:cs="Times New Roman"/>
-        </w:rPr>
-        <w:t>the DDS</w:t>
-      </w:r>
-      <w:proofErr w:type="gramEnd"/>
-      <w:r>
-        <w:rPr>
-          <w:rFonts w:ascii="Times New Roman" w:hAnsi="Times New Roman" w:cs="Times New Roman"/>
-        </w:rPr>
-        <w:t xml:space="preserve"> modules. Originally it was desired to use one DDS for all channels, but instead four smaller DDS modules are used to save money and space. They generate sine waves in the 2.5 or 3.3 V domain, which needs to then be stepped up to the 5 V domain using programmable gain amplifiers. These specifications lead to components in the amplification </w:t>
-      </w:r>
-      <w:proofErr w:type="gramStart"/>
-      <w:r>
-        <w:rPr>
-          <w:rFonts w:ascii="Times New Roman" w:hAnsi="Times New Roman" w:cs="Times New Roman"/>
-        </w:rPr>
-        <w:t>path being</w:t>
-      </w:r>
-      <w:proofErr w:type="gramEnd"/>
-      <w:r>
-        <w:rPr>
-          <w:rFonts w:ascii="Times New Roman" w:hAnsi="Times New Roman" w:cs="Times New Roman"/>
-        </w:rPr>
-        <w:t xml:space="preserve"> mostly buffer op-amps and programmable resistors that are all tolerant up to 5 V.</w:t>
-      </w:r>
-    </w:p>
-    <w:p>
-      <w:pPr>
-        <w:rPr>
-          <w:rFonts w:ascii="Times New Roman" w:hAnsi="Times New Roman" w:cs="Times New Roman"/>
-        </w:rPr>
-      </w:pPr>
-      <w:r>
-        <w:rPr>
-          <w:rFonts w:ascii="Times New Roman" w:hAnsi="Times New Roman" w:cs="Times New Roman"/>
-        </w:rPr>
-        <w:t xml:space="preserve">As the brains of the device, a raspberry pi </w:t>
-      </w:r>
-      <w:proofErr w:type="spellStart"/>
-      <w:r>
-        <w:rPr>
-          <w:rFonts w:ascii="Times New Roman" w:hAnsi="Times New Roman" w:cs="Times New Roman"/>
-        </w:rPr>
-        <w:t>pico</w:t>
-      </w:r>
-      <w:proofErr w:type="spellEnd"/>
-      <w:r>
-        <w:rPr>
-          <w:rFonts w:ascii="Times New Roman" w:hAnsi="Times New Roman" w:cs="Times New Roman"/>
-        </w:rPr>
-        <w:t xml:space="preserve"> has been chosen. Since we have broken </w:t>
-      </w:r>
-      <w:proofErr w:type="gramStart"/>
-      <w:r>
-        <w:rPr>
-          <w:rFonts w:ascii="Times New Roman" w:hAnsi="Times New Roman" w:cs="Times New Roman"/>
-        </w:rPr>
-        <w:t>out generation to</w:t>
-      </w:r>
-      <w:proofErr w:type="gramEnd"/>
-      <w:r>
-        <w:rPr>
-          <w:rFonts w:ascii="Times New Roman" w:hAnsi="Times New Roman" w:cs="Times New Roman"/>
-        </w:rPr>
-        <w:t xml:space="preserve"> DDS’s, the microcontroller only needs to communicate with peripheral devices. This means that it can be a simpler microcontroller, which also has Bluetooth to connect to the mobile app. Another motivation for choosing this microcontroller approach is that resources for writing software for raspberry pi are readily available, making iteration by researchers that may not know all the intricacies of the device easier.</w:t>
-      </w:r>
-    </w:p>
-    <w:p>
-      <w:pPr>
-        <w:rPr>
-          <w:rFonts w:ascii="Times New Roman" w:hAnsi="Times New Roman" w:cs="Times New Roman"/>
-        </w:rPr>
-      </w:pPr>
-      <w:r>
-        <w:rPr>
-          <w:rFonts w:ascii="Times New Roman" w:hAnsi="Times New Roman" w:cs="Times New Roman"/>
-        </w:rPr>
-        <w:t xml:space="preserve">To power the device, we have a rechargeable 3.6 V battery and charging board. We bought </w:t>
-      </w:r>
-      <w:proofErr w:type="gramStart"/>
-      <w:r>
-        <w:rPr>
-          <w:rFonts w:ascii="Times New Roman" w:hAnsi="Times New Roman" w:cs="Times New Roman"/>
-        </w:rPr>
-        <w:t>both of these</w:t>
-      </w:r>
-      <w:proofErr w:type="gramEnd"/>
-      <w:r>
-        <w:rPr>
-          <w:rFonts w:ascii="Times New Roman" w:hAnsi="Times New Roman" w:cs="Times New Roman"/>
-        </w:rPr>
-        <w:t xml:space="preserve"> pre-made. The main goal was to have something lightweight that is easily rechargeable, but at present the battery does not have enough capacity to generate stimulus for 16 hours. In the future, this component will need to be changed.</w:t>
+        <w:t>Feeding into the output transformers are voltage controlled current sources consisting of two op-amps. These step up from the 5 V domain to the 30 V domain, and so are tolerant of input voltages well over 30 V. Resistors for these op-amps again need to be rated for very high power dissipation because current will be forced. Amplification stages leading into the current source consist of programmable resistor dividers feeding into buffers, which ensures signal fidelity and allows an easy way to control attenuation from the microcontroller. The source of sine wave generation is the DDS modules. Originally it was desired to use one DDS for all channels, but instead four smaller DDS modules are used to save money and space. They generate sine waves in the 2.5 or 3.3 V domain, which needs to then be stepped up to the 5 V domain using programmable gain amplifiers. These specifications lead to components in the amplification path being mostly buffer op-amps and programmable resistors that are all tolerant up to 5 V.</w:t>
+      </w:r>
+    </w:p>
+    <w:p>
+      <w:pPr>
+        <w:rPr>
+          <w:rFonts w:ascii="Times New Roman" w:hAnsi="Times New Roman" w:cs="Times New Roman"/>
+        </w:rPr>
+      </w:pPr>
+      <w:r>
+        <w:rPr>
+          <w:rFonts w:ascii="Times New Roman" w:hAnsi="Times New Roman" w:cs="Times New Roman"/>
+        </w:rPr>
+        <w:t>As the brains of the device, a raspberry pi pico has been chosen. Since we have broken out generation to DDS’s, the microcontroller only needs to communicate with peripheral devices. This means that it can be a simpler microcontroller, which also has Bluetooth to connect to the mobile app. Another motivation for choosing this microcontroller approach is that resources for writing software for raspberry pi are readily available, making iteration by researchers that may not know all the intricacies of the device easier.</w:t>
+      </w:r>
+    </w:p>
+    <w:p>
+      <w:pPr>
+        <w:rPr>
+          <w:rFonts w:ascii="Times New Roman" w:hAnsi="Times New Roman" w:cs="Times New Roman"/>
+        </w:rPr>
+      </w:pPr>
+      <w:r>
+        <w:rPr>
+          <w:rFonts w:ascii="Times New Roman" w:hAnsi="Times New Roman" w:cs="Times New Roman"/>
+        </w:rPr>
+        <w:t>To power the device, we have a rechargeable 3.6 V battery and charging board. We bought both of these pre-made. The main goal was to have something lightweight that is easily rechargeable, but at present the battery does not have enough capacity to generate stimulus for 16 hours. In the future, this component will need to be changed.</w:t>
       </w:r>
     </w:p>
     <w:p>
@@ -353,35 +185,1134 @@
         <w:rPr>
           <w:rFonts w:ascii="Times New Roman" w:hAnsi="Times New Roman" w:cs="Times New Roman"/>
         </w:rPr>
-        <w:t xml:space="preserve">Switches and connectors were the final components sourced. BNC connectors are used for the output channels. The goal of these connectors is to allow connection and disconnection of electrodes without soldering, while still providing an electrical connection that isn’t going to pull out and cause discomfort for the patient. The hard kill is a toggle switch to also function as a power on </w:t>
-      </w:r>
-      <w:proofErr w:type="gramStart"/>
-      <w:r>
-        <w:rPr>
-          <w:rFonts w:ascii="Times New Roman" w:hAnsi="Times New Roman" w:cs="Times New Roman"/>
-        </w:rPr>
-        <w:t>switch, but</w:t>
-      </w:r>
-      <w:proofErr w:type="gramEnd"/>
-      <w:r>
-        <w:rPr>
-          <w:rFonts w:ascii="Times New Roman" w:hAnsi="Times New Roman" w:cs="Times New Roman"/>
-        </w:rPr>
-        <w:t xml:space="preserve"> may be too easy to bump and kill the device. Future iterations should </w:t>
-      </w:r>
-      <w:proofErr w:type="gramStart"/>
-      <w:r>
-        <w:rPr>
-          <w:rFonts w:ascii="Times New Roman" w:hAnsi="Times New Roman" w:cs="Times New Roman"/>
-        </w:rPr>
-        <w:t>look into</w:t>
-      </w:r>
-      <w:proofErr w:type="gramEnd"/>
-      <w:r>
-        <w:rPr>
-          <w:rFonts w:ascii="Times New Roman" w:hAnsi="Times New Roman" w:cs="Times New Roman"/>
-        </w:rPr>
-        <w:t xml:space="preserve"> alternative hard kill switches. The soft kill switch is a push toggle button, which is smaller profile and gives a clear visual indication of whether stimulus is on.</w:t>
+        <w:t>Switches and connectors were the final components sourced. BNC connectors are used for the output channels. The goal of these connectors is to allow connection and disconnection of electrodes without soldering, while still providing an electrical connection that isn’t going to pull out and cause discomfort for the patient. The hard kill is a toggle switch to also function as a power on switch, but may be too easy to bump and kill the device. Future iterations should look into alternative hard kill switches. The soft kill switch is a push toggle button, which is smaller profile and gives a clear visual indication of whether stimulus is on.</w:t>
+      </w:r>
+    </w:p>
+    <w:p>
+      <w:pPr>
+        <w:rPr>
+          <w:rFonts w:ascii="Times New Roman" w:hAnsi="Times New Roman" w:cs="Times New Roman"/>
+        </w:rPr>
+      </w:pPr>
+      <w:r>
+        <w:rPr>
+          <w:rFonts w:ascii="Times New Roman" w:hAnsi="Times New Roman" w:cs="Times New Roman"/>
+          <w:b/>
+          <w:bCs/>
+        </w:rPr>
+        <w:t>Future Work</w:t>
+      </w:r>
+    </w:p>
+    <w:p>
+      <w:pPr>
+        <w:rPr>
+          <w:rFonts w:ascii="Times New Roman" w:hAnsi="Times New Roman" w:cs="Times New Roman"/>
+        </w:rPr>
+      </w:pPr>
+      <w:r>
+        <w:rPr>
+          <w:rFonts w:ascii="Times New Roman" w:hAnsi="Times New Roman" w:cs="Times New Roman"/>
+        </w:rPr>
+        <w:lastRenderedPageBreak/>
+        <w:t>The biggest shortcoming of this device was the power supply circuitry. Specifically, the battery was too small and the boost converters did not function as intended.</w:t>
+      </w:r>
+    </w:p>
+    <w:p>
+      <w:pPr>
+        <w:rPr>
+          <w:rFonts w:ascii="Times New Roman" w:hAnsi="Times New Roman" w:cs="Times New Roman"/>
+        </w:rPr>
+      </w:pPr>
+      <w:r>
+        <w:rPr>
+          <w:rFonts w:ascii="Times New Roman" w:hAnsi="Times New Roman" w:cs="Times New Roman"/>
+        </w:rPr>
+        <w:t xml:space="preserve">Any new battery chosen should take into account the constant current draw of the boost converters, so that the device can reliably last 16 hours. Power calculations on the current board did not properly account for these converters. The boost converters themselves were mismatched; the 12 V boost supplied too little </w:t>
+      </w:r>
+      <w:r>
+        <w:rPr>
+          <w:rFonts w:ascii="Times New Roman" w:hAnsi="Times New Roman" w:cs="Times New Roman"/>
+        </w:rPr>
+        <w:t>current,</w:t>
+      </w:r>
+      <w:r>
+        <w:rPr>
+          <w:rFonts w:ascii="Times New Roman" w:hAnsi="Times New Roman" w:cs="Times New Roman"/>
+        </w:rPr>
+        <w:t xml:space="preserve"> and the 30 V boost drew too much current. In the future, the best course of action is likely to go full custom with the 12 V boost converter in a similar fashion to the 30 V converter. This way, battery voltage can be directly connected to the 12 V converter, and the board powered from there. Another power issue was that the 5 V LDO could not thermally keep up with the load. Either a much bigger LDO or a different method of generating 5 V should be chosen in the future. Breaking out the power system into separate boards will allow faster debug and rework of these sections.</w:t>
+      </w:r>
+    </w:p>
+    <w:p>
+      <w:pPr>
+        <w:rPr>
+          <w:rFonts w:ascii="Times New Roman" w:hAnsi="Times New Roman" w:cs="Times New Roman"/>
+        </w:rPr>
+      </w:pPr>
+      <w:r>
+        <w:rPr>
+          <w:rFonts w:ascii="Times New Roman" w:hAnsi="Times New Roman" w:cs="Times New Roman"/>
+        </w:rPr>
+        <w:t>Another piece of future work is on the software side. The hardware will allow amplitude control through the amplifier stages, but there is currently no way to program the amplitude to the device. The mobile app and device software should be modified to allow for amplitude control. Due to the routing of the control signals, all channels currently ramp together. If it is desired to ramp these separately or set different amplitudes between channels, each amplifier will need individual routing, but the programmable gain amplifier can be removed.</w:t>
+      </w:r>
+      <w:r>
+        <w:rPr>
+          <w:rFonts w:ascii="Times New Roman" w:hAnsi="Times New Roman" w:cs="Times New Roman"/>
+        </w:rPr>
+        <w:t xml:space="preserve"> </w:t>
+      </w:r>
+    </w:p>
+    <w:p>
+      <w:pPr>
+        <w:rPr>
+          <w:rFonts w:ascii="Times New Roman" w:hAnsi="Times New Roman" w:cs="Times New Roman"/>
+        </w:rPr>
+      </w:pPr>
+      <w:r>
+        <w:rPr>
+          <w:rFonts w:ascii="Times New Roman" w:hAnsi="Times New Roman" w:cs="Times New Roman"/>
+        </w:rPr>
+        <w:t>Along with this, the on-board clock generator is too high a frequency to get good resolution from the DDS ICs. Either finding new DDSs or a new clock generator is necessary to achieve clarity to the level of individual hertz. The alternative is to program the clock generator for minimum frequency. A register-level value array is provided in the project source files for setting 100 kHz.</w:t>
+      </w:r>
+    </w:p>
+    <w:p>
+      <w:pPr>
+        <w:rPr>
+          <w:rFonts w:ascii="Times New Roman" w:hAnsi="Times New Roman" w:cs="Times New Roman"/>
+        </w:rPr>
+      </w:pPr>
+      <w:r>
+        <w:rPr>
+          <w:rFonts w:ascii="Times New Roman" w:hAnsi="Times New Roman" w:cs="Times New Roman"/>
+        </w:rPr>
+        <w:t>Physical dimensions end up being a limiting factor in the design of the brain stimulator. The device is too big to be reasonably handheld. In the future, pivoting away from large transformers on the output and finding alternative methods of output isolation will allow the footprint to shrink. Along with this, BNC outputs take up considerable space. Changing these out for hardwired electrodes or a different connector will allow the design to shrink further. Adding a belt clip to the back of the housing was an idea discussed but not implemented, which would make the device easier to carry for the patient. A final change on the physical dimension side is finding a new hard kill switch. It is hard to strike a balance between something that is accessible but can’t be accidentally switched off, as the toggle switch may be.</w:t>
+      </w:r>
+    </w:p>
+    <w:p>
+      <w:pPr>
+        <w:rPr>
+          <w:rFonts w:ascii="Times New Roman" w:hAnsi="Times New Roman" w:cs="Times New Roman"/>
+        </w:rPr>
+      </w:pPr>
+      <w:r>
+        <w:rPr>
+          <w:rFonts w:ascii="Times New Roman" w:hAnsi="Times New Roman" w:cs="Times New Roman"/>
+        </w:rPr>
+        <w:t>Overall, more extensive testing on board subcircuits needs to be performed. More breakout boards and small scale testing would give us reliable results to back up our simulations.</w:t>
+      </w:r>
+    </w:p>
+    <w:p>
+      <w:pPr>
+        <w:rPr>
+          <w:rFonts w:ascii="Times New Roman" w:hAnsi="Times New Roman" w:cs="Times New Roman"/>
+          <w:b/>
+          <w:bCs/>
+        </w:rPr>
+      </w:pPr>
+      <w:r>
+        <w:rPr>
+          <w:rFonts w:ascii="Times New Roman" w:hAnsi="Times New Roman" w:cs="Times New Roman"/>
+          <w:b/>
+          <w:bCs/>
+        </w:rPr>
+        <w:t>Hardware</w:t>
+      </w:r>
+      <w:r>
+        <w:rPr>
+          <w:rFonts w:ascii="Times New Roman" w:hAnsi="Times New Roman" w:cs="Times New Roman"/>
+          <w:b/>
+          <w:bCs/>
+        </w:rPr>
+        <w:t>/Circuit Schematics (3 and 5)</w:t>
+      </w:r>
+    </w:p>
+    <w:p>
+      <w:pPr>
+        <w:rPr>
+          <w:rFonts w:ascii="Times New Roman" w:hAnsi="Times New Roman" w:cs="Times New Roman"/>
+        </w:rPr>
+      </w:pPr>
+      <w:r>
+        <w:rPr>
+          <w:rFonts w:ascii="Times New Roman" w:hAnsi="Times New Roman" w:cs="Times New Roman"/>
+          <w:noProof/>
+        </w:rPr>
+        <w:lastRenderedPageBreak/>
+        <w:drawing>
+          <wp:inline distT="0" distB="0" distL="0" distR="0" wp14:anchorId="190DADBE" wp14:editId="7306B908">
+            <wp:extent cx="4820068" cy="5582134"/>
+            <wp:effectExtent l="0" t="0" r="0" b="0"/>
+            <wp:docPr id="1753775934" name="Picture 14" descr="A green circuit board with red lines and white text&#10;&#10;AI-generated content may be incorrect."/>
+            <wp:cNvGraphicFramePr>
+              <a:graphicFrameLocks xmlns:a="http://schemas.openxmlformats.org/drawingml/2006/main" noChangeAspect="1"/>
+            </wp:cNvGraphicFramePr>
+            <a:graphic xmlns:a="http://schemas.openxmlformats.org/drawingml/2006/main">
+              <a:graphicData uri="http://schemas.openxmlformats.org/drawingml/2006/picture">
+                <pic:pic xmlns:pic="http://schemas.openxmlformats.org/drawingml/2006/picture">
+                  <pic:nvPicPr>
+                    <pic:cNvPr id="1753775934" name="Picture 14" descr="A green circuit board with red lines and white text&#10;&#10;AI-generated content may be incorrect."/>
+                    <pic:cNvPicPr/>
+                  </pic:nvPicPr>
+                  <pic:blipFill>
+                    <a:blip r:embed="rId4" cstate="print">
+                      <a:extLst>
+                        <a:ext uri="{28A0092B-C50C-407E-A947-70E740481C1C}">
+                          <a14:useLocalDpi xmlns:a14="http://schemas.microsoft.com/office/drawing/2010/main" val="0"/>
+                        </a:ext>
+                      </a:extLst>
+                    </a:blip>
+                    <a:stretch>
+                      <a:fillRect/>
+                    </a:stretch>
+                  </pic:blipFill>
+                  <pic:spPr>
+                    <a:xfrm>
+                      <a:off x="0" y="0"/>
+                      <a:ext cx="4820068" cy="5582134"/>
+                    </a:xfrm>
+                    <a:prstGeom prst="rect">
+                      <a:avLst/>
+                    </a:prstGeom>
+                  </pic:spPr>
+                </pic:pic>
+              </a:graphicData>
+            </a:graphic>
+          </wp:inline>
+        </w:drawing>
+      </w:r>
+    </w:p>
+    <w:p>
+      <w:pPr>
+        <w:rPr>
+          <w:rFonts w:ascii="Times New Roman" w:hAnsi="Times New Roman" w:cs="Times New Roman"/>
+        </w:rPr>
+      </w:pPr>
+      <w:r>
+        <w:rPr>
+          <w:rFonts w:ascii="Times New Roman" w:hAnsi="Times New Roman" w:cs="Times New Roman"/>
+        </w:rPr>
+        <w:t xml:space="preserve">Figure A shows the 3D layout of the PCB. It is divided into power supplies, MCU, clock, DDS, amplification, output isolation, and feedback. Horizontally each channel and </w:t>
+      </w:r>
+      <w:r>
+        <w:rPr>
+          <w:rFonts w:ascii="Times New Roman" w:hAnsi="Times New Roman" w:cs="Times New Roman"/>
+        </w:rPr>
+        <w:t>its</w:t>
+      </w:r>
+      <w:r>
+        <w:rPr>
+          <w:rFonts w:ascii="Times New Roman" w:hAnsi="Times New Roman" w:cs="Times New Roman"/>
+        </w:rPr>
+        <w:t xml:space="preserve"> amplification stages are laid out in layers across the top of the board. The battery connects to headers directly below the MCU, and the 12 V boost converter, which is premade, attaches to the </w:t>
+      </w:r>
+      <w:r>
+        <w:rPr>
+          <w:rFonts w:ascii="Times New Roman" w:hAnsi="Times New Roman" w:cs="Times New Roman"/>
+        </w:rPr>
+        <w:t>4-pin</w:t>
+      </w:r>
+      <w:r>
+        <w:rPr>
+          <w:rFonts w:ascii="Times New Roman" w:hAnsi="Times New Roman" w:cs="Times New Roman"/>
+        </w:rPr>
+        <w:t xml:space="preserve"> footprint as shown.</w:t>
+      </w:r>
+    </w:p>
+    <w:p>
+      <w:pPr>
+        <w:rPr>
+          <w:rFonts w:ascii="Times New Roman" w:hAnsi="Times New Roman" w:cs="Times New Roman"/>
+        </w:rPr>
+      </w:pPr>
+      <w:r>
+        <w:rPr>
+          <w:rFonts w:ascii="Times New Roman" w:hAnsi="Times New Roman" w:cs="Times New Roman"/>
+          <w:noProof/>
+        </w:rPr>
+        <w:lastRenderedPageBreak/>
+        <w:drawing>
+          <wp:inline distT="0" distB="0" distL="0" distR="0" wp14:anchorId="7A0B6311" wp14:editId="40721119">
+            <wp:extent cx="5943600" cy="3550285"/>
+            <wp:effectExtent l="0" t="0" r="0" b="0"/>
+            <wp:docPr id="1613055988" name="Picture 15" descr="A screenshot of a computer&#10;&#10;AI-generated content may be incorrect."/>
+            <wp:cNvGraphicFramePr>
+              <a:graphicFrameLocks xmlns:a="http://schemas.openxmlformats.org/drawingml/2006/main" noChangeAspect="1"/>
+            </wp:cNvGraphicFramePr>
+            <a:graphic xmlns:a="http://schemas.openxmlformats.org/drawingml/2006/main">
+              <a:graphicData uri="http://schemas.openxmlformats.org/drawingml/2006/picture">
+                <pic:pic xmlns:pic="http://schemas.openxmlformats.org/drawingml/2006/picture">
+                  <pic:nvPicPr>
+                    <pic:cNvPr id="1613055988" name="Picture 15" descr="A screenshot of a computer&#10;&#10;AI-generated content may be incorrect."/>
+                    <pic:cNvPicPr/>
+                  </pic:nvPicPr>
+                  <pic:blipFill>
+                    <a:blip r:embed="rId5" cstate="print">
+                      <a:extLst>
+                        <a:ext uri="{28A0092B-C50C-407E-A947-70E740481C1C}">
+                          <a14:useLocalDpi xmlns:a14="http://schemas.microsoft.com/office/drawing/2010/main" val="0"/>
+                        </a:ext>
+                      </a:extLst>
+                    </a:blip>
+                    <a:stretch>
+                      <a:fillRect/>
+                    </a:stretch>
+                  </pic:blipFill>
+                  <pic:spPr>
+                    <a:xfrm>
+                      <a:off x="0" y="0"/>
+                      <a:ext cx="5943600" cy="3550285"/>
+                    </a:xfrm>
+                    <a:prstGeom prst="rect">
+                      <a:avLst/>
+                    </a:prstGeom>
+                  </pic:spPr>
+                </pic:pic>
+              </a:graphicData>
+            </a:graphic>
+          </wp:inline>
+        </w:drawing>
+      </w:r>
+    </w:p>
+    <w:p>
+      <w:pPr>
+        <w:rPr>
+          <w:rFonts w:ascii="Times New Roman" w:hAnsi="Times New Roman" w:cs="Times New Roman"/>
+        </w:rPr>
+      </w:pPr>
+      <w:r>
+        <w:rPr>
+          <w:rFonts w:ascii="Times New Roman" w:hAnsi="Times New Roman" w:cs="Times New Roman"/>
+        </w:rPr>
+        <w:t>Figure B shows a schematic level view of the LDOs on-board. The 3.3 V LDO is optionally excluded, as the MCU will generate 3.3 V. 5 V feeds into the MCU, and 2.5 V is used for midpoint selection of the voltage controlled current source, explained later.</w:t>
+      </w:r>
+    </w:p>
+    <w:p>
+      <w:pPr>
+        <w:rPr>
+          <w:rFonts w:ascii="Times New Roman" w:hAnsi="Times New Roman" w:cs="Times New Roman"/>
+        </w:rPr>
+      </w:pPr>
+      <w:r>
+        <w:rPr>
+          <w:rFonts w:ascii="Times New Roman" w:hAnsi="Times New Roman" w:cs="Times New Roman"/>
+          <w:noProof/>
+        </w:rPr>
+        <w:drawing>
+          <wp:inline distT="0" distB="0" distL="0" distR="0" wp14:anchorId="28D958AC" wp14:editId="7A41915A">
+            <wp:extent cx="5943600" cy="2829560"/>
+            <wp:effectExtent l="0" t="0" r="0" b="8890"/>
+            <wp:docPr id="1953547399" name="Picture 16" descr="A diagram of a circuit&#10;&#10;AI-generated content may be incorrect."/>
+            <wp:cNvGraphicFramePr>
+              <a:graphicFrameLocks xmlns:a="http://schemas.openxmlformats.org/drawingml/2006/main" noChangeAspect="1"/>
+            </wp:cNvGraphicFramePr>
+            <a:graphic xmlns:a="http://schemas.openxmlformats.org/drawingml/2006/main">
+              <a:graphicData uri="http://schemas.openxmlformats.org/drawingml/2006/picture">
+                <pic:pic xmlns:pic="http://schemas.openxmlformats.org/drawingml/2006/picture">
+                  <pic:nvPicPr>
+                    <pic:cNvPr id="1953547399" name="Picture 16" descr="A diagram of a circuit&#10;&#10;AI-generated content may be incorrect."/>
+                    <pic:cNvPicPr/>
+                  </pic:nvPicPr>
+                  <pic:blipFill>
+                    <a:blip r:embed="rId6" cstate="print">
+                      <a:extLst>
+                        <a:ext uri="{28A0092B-C50C-407E-A947-70E740481C1C}">
+                          <a14:useLocalDpi xmlns:a14="http://schemas.microsoft.com/office/drawing/2010/main" val="0"/>
+                        </a:ext>
+                      </a:extLst>
+                    </a:blip>
+                    <a:stretch>
+                      <a:fillRect/>
+                    </a:stretch>
+                  </pic:blipFill>
+                  <pic:spPr>
+                    <a:xfrm>
+                      <a:off x="0" y="0"/>
+                      <a:ext cx="5943600" cy="2829560"/>
+                    </a:xfrm>
+                    <a:prstGeom prst="rect">
+                      <a:avLst/>
+                    </a:prstGeom>
+                  </pic:spPr>
+                </pic:pic>
+              </a:graphicData>
+            </a:graphic>
+          </wp:inline>
+        </w:drawing>
+      </w:r>
+    </w:p>
+    <w:p>
+      <w:pPr>
+        <w:rPr>
+          <w:rFonts w:ascii="Times New Roman" w:hAnsi="Times New Roman" w:cs="Times New Roman"/>
+        </w:rPr>
+      </w:pPr>
+      <w:r>
+        <w:rPr>
+          <w:rFonts w:ascii="Times New Roman" w:hAnsi="Times New Roman" w:cs="Times New Roman"/>
+        </w:rPr>
+        <w:t xml:space="preserve">Figure C shows the </w:t>
+      </w:r>
+      <w:r>
+        <w:rPr>
+          <w:rFonts w:ascii="Times New Roman" w:hAnsi="Times New Roman" w:cs="Times New Roman"/>
+        </w:rPr>
+        <w:t>30 V flyback converter. It is divided into the switching controller in the 12 V domain and output filtering in the 30 V domain. The switching controller drives current on one direction through the transformer, which then uses Zener diodes on the secondary to generate a stable 30 V positive and negative rail at the output.</w:t>
+      </w:r>
+    </w:p>
+    <w:p>
+      <w:pPr>
+        <w:rPr>
+          <w:rFonts w:ascii="Times New Roman" w:hAnsi="Times New Roman" w:cs="Times New Roman"/>
+        </w:rPr>
+      </w:pPr>
+      <w:r>
+        <w:rPr>
+          <w:rFonts w:ascii="Times New Roman" w:hAnsi="Times New Roman" w:cs="Times New Roman"/>
+          <w:noProof/>
+        </w:rPr>
+        <w:lastRenderedPageBreak/>
+        <w:drawing>
+          <wp:inline distT="0" distB="0" distL="0" distR="0" wp14:anchorId="3B0B9822" wp14:editId="3885A617">
+            <wp:extent cx="5943600" cy="4787900"/>
+            <wp:effectExtent l="0" t="0" r="0" b="0"/>
+            <wp:docPr id="539307565" name="Picture 17" descr="A diagram of a computer&#10;&#10;AI-generated content may be incorrect."/>
+            <wp:cNvGraphicFramePr>
+              <a:graphicFrameLocks xmlns:a="http://schemas.openxmlformats.org/drawingml/2006/main" noChangeAspect="1"/>
+            </wp:cNvGraphicFramePr>
+            <a:graphic xmlns:a="http://schemas.openxmlformats.org/drawingml/2006/main">
+              <a:graphicData uri="http://schemas.openxmlformats.org/drawingml/2006/picture">
+                <pic:pic xmlns:pic="http://schemas.openxmlformats.org/drawingml/2006/picture">
+                  <pic:nvPicPr>
+                    <pic:cNvPr id="539307565" name="Picture 17" descr="A diagram of a computer&#10;&#10;AI-generated content may be incorrect."/>
+                    <pic:cNvPicPr/>
+                  </pic:nvPicPr>
+                  <pic:blipFill>
+                    <a:blip r:embed="rId7" cstate="print">
+                      <a:extLst>
+                        <a:ext uri="{28A0092B-C50C-407E-A947-70E740481C1C}">
+                          <a14:useLocalDpi xmlns:a14="http://schemas.microsoft.com/office/drawing/2010/main" val="0"/>
+                        </a:ext>
+                      </a:extLst>
+                    </a:blip>
+                    <a:stretch>
+                      <a:fillRect/>
+                    </a:stretch>
+                  </pic:blipFill>
+                  <pic:spPr>
+                    <a:xfrm>
+                      <a:off x="0" y="0"/>
+                      <a:ext cx="5943600" cy="4787900"/>
+                    </a:xfrm>
+                    <a:prstGeom prst="rect">
+                      <a:avLst/>
+                    </a:prstGeom>
+                  </pic:spPr>
+                </pic:pic>
+              </a:graphicData>
+            </a:graphic>
+          </wp:inline>
+        </w:drawing>
+      </w:r>
+    </w:p>
+    <w:p>
+      <w:pPr>
+        <w:rPr>
+          <w:rFonts w:ascii="Times New Roman" w:hAnsi="Times New Roman" w:cs="Times New Roman"/>
+        </w:rPr>
+      </w:pPr>
+      <w:r>
+        <w:rPr>
+          <w:rFonts w:ascii="Times New Roman" w:hAnsi="Times New Roman" w:cs="Times New Roman"/>
+        </w:rPr>
+        <w:t>Figure D shows MCU connections. The main role of the MCU is to communicate with and program peripherals. To do this, it makes use of SPI, I2C, and custom up/down protocols. This MCU is the Raspberry Pi Pico, and can generate 3.3 V output for the rest of the board. The USB port of the MCU is hidden when in the housing so that it cannot be reprogrammed without taking it apart.</w:t>
+      </w:r>
+    </w:p>
+    <w:p>
+      <w:pPr>
+        <w:rPr>
+          <w:rFonts w:ascii="Times New Roman" w:hAnsi="Times New Roman" w:cs="Times New Roman"/>
+        </w:rPr>
+      </w:pPr>
+      <w:r>
+        <w:rPr>
+          <w:rFonts w:ascii="Times New Roman" w:hAnsi="Times New Roman" w:cs="Times New Roman"/>
+          <w:noProof/>
+        </w:rPr>
+        <w:lastRenderedPageBreak/>
+        <w:drawing>
+          <wp:inline distT="0" distB="0" distL="0" distR="0" wp14:anchorId="0E1D02F4" wp14:editId="04B540DA">
+            <wp:extent cx="5162997" cy="4877223"/>
+            <wp:effectExtent l="0" t="0" r="0" b="0"/>
+            <wp:docPr id="1661467092" name="Picture 20" descr="A diagram of a circuit&#10;&#10;AI-generated content may be incorrect."/>
+            <wp:cNvGraphicFramePr>
+              <a:graphicFrameLocks xmlns:a="http://schemas.openxmlformats.org/drawingml/2006/main" noChangeAspect="1"/>
+            </wp:cNvGraphicFramePr>
+            <a:graphic xmlns:a="http://schemas.openxmlformats.org/drawingml/2006/main">
+              <a:graphicData uri="http://schemas.openxmlformats.org/drawingml/2006/picture">
+                <pic:pic xmlns:pic="http://schemas.openxmlformats.org/drawingml/2006/picture">
+                  <pic:nvPicPr>
+                    <pic:cNvPr id="1661467092" name="Picture 20" descr="A diagram of a circuit&#10;&#10;AI-generated content may be incorrect."/>
+                    <pic:cNvPicPr/>
+                  </pic:nvPicPr>
+                  <pic:blipFill>
+                    <a:blip r:embed="rId8" cstate="print">
+                      <a:extLst>
+                        <a:ext uri="{28A0092B-C50C-407E-A947-70E740481C1C}">
+                          <a14:useLocalDpi xmlns:a14="http://schemas.microsoft.com/office/drawing/2010/main" val="0"/>
+                        </a:ext>
+                      </a:extLst>
+                    </a:blip>
+                    <a:stretch>
+                      <a:fillRect/>
+                    </a:stretch>
+                  </pic:blipFill>
+                  <pic:spPr>
+                    <a:xfrm>
+                      <a:off x="0" y="0"/>
+                      <a:ext cx="5162997" cy="4877223"/>
+                    </a:xfrm>
+                    <a:prstGeom prst="rect">
+                      <a:avLst/>
+                    </a:prstGeom>
+                  </pic:spPr>
+                </pic:pic>
+              </a:graphicData>
+            </a:graphic>
+          </wp:inline>
+        </w:drawing>
+      </w:r>
+    </w:p>
+    <w:p>
+      <w:pPr>
+        <w:rPr>
+          <w:rFonts w:ascii="Times New Roman" w:hAnsi="Times New Roman" w:cs="Times New Roman"/>
+        </w:rPr>
+      </w:pPr>
+      <w:r>
+        <w:rPr>
+          <w:rFonts w:ascii="Times New Roman" w:hAnsi="Times New Roman" w:cs="Times New Roman"/>
+        </w:rPr>
+        <w:t>Figure E shows the isolation transformers and BNC outputs. These transformers are the biggest components on the board, responsible for isolating the current sources without dropping significant current. The transformers feed the signal into the BNC ports to connect to the electrodes. This signal then comes back through the ADCs and into the transformer.</w:t>
+      </w:r>
+    </w:p>
+    <w:p>
+      <w:pPr>
+        <w:rPr>
+          <w:rFonts w:ascii="Times New Roman" w:hAnsi="Times New Roman" w:cs="Times New Roman"/>
+        </w:rPr>
+      </w:pPr>
+      <w:r>
+        <w:rPr>
+          <w:rFonts w:ascii="Times New Roman" w:hAnsi="Times New Roman" w:cs="Times New Roman"/>
+          <w:noProof/>
+        </w:rPr>
+        <w:lastRenderedPageBreak/>
+        <w:drawing>
+          <wp:inline distT="0" distB="0" distL="0" distR="0" wp14:anchorId="097AE17B" wp14:editId="3FED1116">
+            <wp:extent cx="5296359" cy="2495766"/>
+            <wp:effectExtent l="0" t="0" r="0" b="0"/>
+            <wp:docPr id="1906799848" name="Picture 18" descr="A diagram of a circuit&#10;&#10;AI-generated content may be incorrect."/>
+            <wp:cNvGraphicFramePr>
+              <a:graphicFrameLocks xmlns:a="http://schemas.openxmlformats.org/drawingml/2006/main" noChangeAspect="1"/>
+            </wp:cNvGraphicFramePr>
+            <a:graphic xmlns:a="http://schemas.openxmlformats.org/drawingml/2006/main">
+              <a:graphicData uri="http://schemas.openxmlformats.org/drawingml/2006/picture">
+                <pic:pic xmlns:pic="http://schemas.openxmlformats.org/drawingml/2006/picture">
+                  <pic:nvPicPr>
+                    <pic:cNvPr id="1906799848" name="Picture 18" descr="A diagram of a circuit&#10;&#10;AI-generated content may be incorrect."/>
+                    <pic:cNvPicPr/>
+                  </pic:nvPicPr>
+                  <pic:blipFill>
+                    <a:blip r:embed="rId9" cstate="print">
+                      <a:extLst>
+                        <a:ext uri="{28A0092B-C50C-407E-A947-70E740481C1C}">
+                          <a14:useLocalDpi xmlns:a14="http://schemas.microsoft.com/office/drawing/2010/main" val="0"/>
+                        </a:ext>
+                      </a:extLst>
+                    </a:blip>
+                    <a:stretch>
+                      <a:fillRect/>
+                    </a:stretch>
+                  </pic:blipFill>
+                  <pic:spPr>
+                    <a:xfrm>
+                      <a:off x="0" y="0"/>
+                      <a:ext cx="5296359" cy="2495766"/>
+                    </a:xfrm>
+                    <a:prstGeom prst="rect">
+                      <a:avLst/>
+                    </a:prstGeom>
+                  </pic:spPr>
+                </pic:pic>
+              </a:graphicData>
+            </a:graphic>
+          </wp:inline>
+        </w:drawing>
+      </w:r>
+    </w:p>
+    <w:p>
+      <w:pPr>
+        <w:rPr>
+          <w:rFonts w:ascii="Times New Roman" w:hAnsi="Times New Roman" w:cs="Times New Roman"/>
+        </w:rPr>
+      </w:pPr>
+      <w:r>
+        <w:rPr>
+          <w:rFonts w:ascii="Times New Roman" w:hAnsi="Times New Roman" w:cs="Times New Roman"/>
+        </w:rPr>
+        <w:t>Figure F shows the isolated 3.3 V power supply. This supply is used for the analog domain of the ADCs so that they do not reference the on-board ground. This way, generated stimulus does not interfere between channels.</w:t>
+      </w:r>
+    </w:p>
+    <w:p>
+      <w:pPr>
+        <w:rPr>
+          <w:rFonts w:ascii="Times New Roman" w:hAnsi="Times New Roman" w:cs="Times New Roman"/>
+        </w:rPr>
+      </w:pPr>
+      <w:r>
+        <w:rPr>
+          <w:rFonts w:ascii="Times New Roman" w:hAnsi="Times New Roman" w:cs="Times New Roman"/>
+          <w:noProof/>
+        </w:rPr>
+        <w:drawing>
+          <wp:inline distT="0" distB="0" distL="0" distR="0" wp14:anchorId="1C0DCE95" wp14:editId="572EF801">
+            <wp:extent cx="5772650" cy="2876799"/>
+            <wp:effectExtent l="0" t="0" r="0" b="0"/>
+            <wp:docPr id="578983280" name="Picture 19" descr="A diagram of a computer&#10;&#10;AI-generated content may be incorrect."/>
+            <wp:cNvGraphicFramePr>
+              <a:graphicFrameLocks xmlns:a="http://schemas.openxmlformats.org/drawingml/2006/main" noChangeAspect="1"/>
+            </wp:cNvGraphicFramePr>
+            <a:graphic xmlns:a="http://schemas.openxmlformats.org/drawingml/2006/main">
+              <a:graphicData uri="http://schemas.openxmlformats.org/drawingml/2006/picture">
+                <pic:pic xmlns:pic="http://schemas.openxmlformats.org/drawingml/2006/picture">
+                  <pic:nvPicPr>
+                    <pic:cNvPr id="578983280" name="Picture 19" descr="A diagram of a computer&#10;&#10;AI-generated content may be incorrect."/>
+                    <pic:cNvPicPr/>
+                  </pic:nvPicPr>
+                  <pic:blipFill>
+                    <a:blip r:embed="rId10" cstate="print">
+                      <a:extLst>
+                        <a:ext uri="{28A0092B-C50C-407E-A947-70E740481C1C}">
+                          <a14:useLocalDpi xmlns:a14="http://schemas.microsoft.com/office/drawing/2010/main" val="0"/>
+                        </a:ext>
+                      </a:extLst>
+                    </a:blip>
+                    <a:stretch>
+                      <a:fillRect/>
+                    </a:stretch>
+                  </pic:blipFill>
+                  <pic:spPr>
+                    <a:xfrm>
+                      <a:off x="0" y="0"/>
+                      <a:ext cx="5772650" cy="2876799"/>
+                    </a:xfrm>
+                    <a:prstGeom prst="rect">
+                      <a:avLst/>
+                    </a:prstGeom>
+                  </pic:spPr>
+                </pic:pic>
+              </a:graphicData>
+            </a:graphic>
+          </wp:inline>
+        </w:drawing>
+      </w:r>
+    </w:p>
+    <w:p>
+      <w:pPr>
+        <w:rPr>
+          <w:rFonts w:ascii="Times New Roman" w:hAnsi="Times New Roman" w:cs="Times New Roman"/>
+        </w:rPr>
+      </w:pPr>
+      <w:r>
+        <w:rPr>
+          <w:rFonts w:ascii="Times New Roman" w:hAnsi="Times New Roman" w:cs="Times New Roman"/>
+        </w:rPr>
+        <w:t>Figure G shows one of the isolating ADCs. The analog and digital domains have separate grounds, so that the MCU can read out the voltage across the resistor. This voltage is used to calculate current so that the current source control can be adjusted to the correct amplitude. This ADC stage is necessary because of the use of transformers for isolation.</w:t>
+      </w:r>
+    </w:p>
+    <w:p>
+      <w:pPr>
+        <w:rPr>
+          <w:rFonts w:ascii="Times New Roman" w:hAnsi="Times New Roman" w:cs="Times New Roman"/>
+        </w:rPr>
+      </w:pPr>
+      <w:r>
+        <w:rPr>
+          <w:rFonts w:ascii="Times New Roman" w:hAnsi="Times New Roman" w:cs="Times New Roman"/>
+          <w:noProof/>
+        </w:rPr>
+        <w:lastRenderedPageBreak/>
+        <w:drawing>
+          <wp:inline distT="0" distB="0" distL="0" distR="0" wp14:anchorId="709689A6" wp14:editId="0DE64D45">
+            <wp:extent cx="5943600" cy="1939925"/>
+            <wp:effectExtent l="0" t="0" r="0" b="3175"/>
+            <wp:docPr id="34123577" name="Picture 21" descr="A diagram of a mathematical equation&#10;&#10;AI-generated content may be incorrect."/>
+            <wp:cNvGraphicFramePr>
+              <a:graphicFrameLocks xmlns:a="http://schemas.openxmlformats.org/drawingml/2006/main" noChangeAspect="1"/>
+            </wp:cNvGraphicFramePr>
+            <a:graphic xmlns:a="http://schemas.openxmlformats.org/drawingml/2006/main">
+              <a:graphicData uri="http://schemas.openxmlformats.org/drawingml/2006/picture">
+                <pic:pic xmlns:pic="http://schemas.openxmlformats.org/drawingml/2006/picture">
+                  <pic:nvPicPr>
+                    <pic:cNvPr id="34123577" name="Picture 21" descr="A diagram of a mathematical equation&#10;&#10;AI-generated content may be incorrect."/>
+                    <pic:cNvPicPr/>
+                  </pic:nvPicPr>
+                  <pic:blipFill>
+                    <a:blip r:embed="rId11" cstate="print">
+                      <a:extLst>
+                        <a:ext uri="{28A0092B-C50C-407E-A947-70E740481C1C}">
+                          <a14:useLocalDpi xmlns:a14="http://schemas.microsoft.com/office/drawing/2010/main" val="0"/>
+                        </a:ext>
+                      </a:extLst>
+                    </a:blip>
+                    <a:stretch>
+                      <a:fillRect/>
+                    </a:stretch>
+                  </pic:blipFill>
+                  <pic:spPr>
+                    <a:xfrm>
+                      <a:off x="0" y="0"/>
+                      <a:ext cx="5943600" cy="1939925"/>
+                    </a:xfrm>
+                    <a:prstGeom prst="rect">
+                      <a:avLst/>
+                    </a:prstGeom>
+                  </pic:spPr>
+                </pic:pic>
+              </a:graphicData>
+            </a:graphic>
+          </wp:inline>
+        </w:drawing>
+      </w:r>
+    </w:p>
+    <w:p>
+      <w:pPr>
+        <w:rPr>
+          <w:rFonts w:ascii="Times New Roman" w:hAnsi="Times New Roman" w:cs="Times New Roman"/>
+        </w:rPr>
+      </w:pPr>
+      <w:r>
+        <w:rPr>
+          <w:rFonts w:ascii="Times New Roman" w:hAnsi="Times New Roman" w:cs="Times New Roman"/>
+        </w:rPr>
+        <w:t xml:space="preserve">Figure H shows the schematic view of the clock generator. This generator utilizes a programmable clock divider and </w:t>
+      </w:r>
+      <w:r>
+        <w:rPr>
+          <w:rFonts w:ascii="Times New Roman" w:hAnsi="Times New Roman" w:cs="Times New Roman"/>
+        </w:rPr>
+        <w:t>25 MHz crystal to output up to three clocks, although only one is used. This clock generator need only be programmed once at power up and then left alone. It feeds into the DDS ICs so that they can derive their phase and frequency data from a common source.</w:t>
+      </w:r>
+    </w:p>
+    <w:p>
+      <w:pPr>
+        <w:rPr>
+          <w:rFonts w:ascii="Times New Roman" w:hAnsi="Times New Roman" w:cs="Times New Roman"/>
+        </w:rPr>
+      </w:pPr>
+      <w:r>
+        <w:rPr>
+          <w:rFonts w:ascii="Times New Roman" w:hAnsi="Times New Roman" w:cs="Times New Roman"/>
+          <w:noProof/>
+        </w:rPr>
+        <w:drawing>
+          <wp:inline distT="0" distB="0" distL="0" distR="0" wp14:anchorId="43D37697" wp14:editId="3E2E364F">
+            <wp:extent cx="5943600" cy="2987040"/>
+            <wp:effectExtent l="0" t="0" r="0" b="3810"/>
+            <wp:docPr id="1113396255" name="Picture 22" descr="A diagram of a computer&#10;&#10;AI-generated content may be incorrect."/>
+            <wp:cNvGraphicFramePr>
+              <a:graphicFrameLocks xmlns:a="http://schemas.openxmlformats.org/drawingml/2006/main" noChangeAspect="1"/>
+            </wp:cNvGraphicFramePr>
+            <a:graphic xmlns:a="http://schemas.openxmlformats.org/drawingml/2006/main">
+              <a:graphicData uri="http://schemas.openxmlformats.org/drawingml/2006/picture">
+                <pic:pic xmlns:pic="http://schemas.openxmlformats.org/drawingml/2006/picture">
+                  <pic:nvPicPr>
+                    <pic:cNvPr id="1113396255" name="Picture 22" descr="A diagram of a computer&#10;&#10;AI-generated content may be incorrect."/>
+                    <pic:cNvPicPr/>
+                  </pic:nvPicPr>
+                  <pic:blipFill>
+                    <a:blip r:embed="rId12" cstate="print">
+                      <a:extLst>
+                        <a:ext uri="{28A0092B-C50C-407E-A947-70E740481C1C}">
+                          <a14:useLocalDpi xmlns:a14="http://schemas.microsoft.com/office/drawing/2010/main" val="0"/>
+                        </a:ext>
+                      </a:extLst>
+                    </a:blip>
+                    <a:stretch>
+                      <a:fillRect/>
+                    </a:stretch>
+                  </pic:blipFill>
+                  <pic:spPr>
+                    <a:xfrm>
+                      <a:off x="0" y="0"/>
+                      <a:ext cx="5943600" cy="2987040"/>
+                    </a:xfrm>
+                    <a:prstGeom prst="rect">
+                      <a:avLst/>
+                    </a:prstGeom>
+                  </pic:spPr>
+                </pic:pic>
+              </a:graphicData>
+            </a:graphic>
+          </wp:inline>
+        </w:drawing>
+      </w:r>
+    </w:p>
+    <w:p>
+      <w:pPr>
+        <w:rPr>
+          <w:rFonts w:ascii="Times New Roman" w:hAnsi="Times New Roman" w:cs="Times New Roman"/>
+        </w:rPr>
+      </w:pPr>
+      <w:r>
+        <w:rPr>
+          <w:rFonts w:ascii="Times New Roman" w:hAnsi="Times New Roman" w:cs="Times New Roman"/>
+        </w:rPr>
+        <w:t>Figure I shows the schematic of a DDS. This is used to generate a sine wave that can go through amplification. Frequency and phase offset are programmed by the MCU. To synchronize with other DDSs, the reset must be released on all of them at the same time so that phase information is accurate. Along with sine waves, the DDS used is capable of generating sawtooth waves. However, there is no triangle or square wave support.</w:t>
+      </w:r>
+    </w:p>
+    <w:p>
+      <w:pPr>
+        <w:rPr>
+          <w:rFonts w:ascii="Times New Roman" w:hAnsi="Times New Roman" w:cs="Times New Roman"/>
+        </w:rPr>
+      </w:pPr>
+      <w:r>
+        <w:rPr>
+          <w:rFonts w:ascii="Times New Roman" w:hAnsi="Times New Roman" w:cs="Times New Roman"/>
+          <w:noProof/>
+        </w:rPr>
+        <w:lastRenderedPageBreak/>
+        <w:drawing>
+          <wp:inline distT="0" distB="0" distL="0" distR="0" wp14:anchorId="0142FB27" wp14:editId="3C4BACBA">
+            <wp:extent cx="5943600" cy="2433955"/>
+            <wp:effectExtent l="0" t="0" r="0" b="4445"/>
+            <wp:docPr id="742264646" name="Picture 23" descr="A diagram of a circuit&#10;&#10;AI-generated content may be incorrect."/>
+            <wp:cNvGraphicFramePr>
+              <a:graphicFrameLocks xmlns:a="http://schemas.openxmlformats.org/drawingml/2006/main" noChangeAspect="1"/>
+            </wp:cNvGraphicFramePr>
+            <a:graphic xmlns:a="http://schemas.openxmlformats.org/drawingml/2006/main">
+              <a:graphicData uri="http://schemas.openxmlformats.org/drawingml/2006/picture">
+                <pic:pic xmlns:pic="http://schemas.openxmlformats.org/drawingml/2006/picture">
+                  <pic:nvPicPr>
+                    <pic:cNvPr id="742264646" name="Picture 23" descr="A diagram of a circuit&#10;&#10;AI-generated content may be incorrect."/>
+                    <pic:cNvPicPr/>
+                  </pic:nvPicPr>
+                  <pic:blipFill>
+                    <a:blip r:embed="rId13" cstate="print">
+                      <a:extLst>
+                        <a:ext uri="{28A0092B-C50C-407E-A947-70E740481C1C}">
+                          <a14:useLocalDpi xmlns:a14="http://schemas.microsoft.com/office/drawing/2010/main" val="0"/>
+                        </a:ext>
+                      </a:extLst>
+                    </a:blip>
+                    <a:stretch>
+                      <a:fillRect/>
+                    </a:stretch>
+                  </pic:blipFill>
+                  <pic:spPr>
+                    <a:xfrm>
+                      <a:off x="0" y="0"/>
+                      <a:ext cx="5943600" cy="2433955"/>
+                    </a:xfrm>
+                    <a:prstGeom prst="rect">
+                      <a:avLst/>
+                    </a:prstGeom>
+                  </pic:spPr>
+                </pic:pic>
+              </a:graphicData>
+            </a:graphic>
+          </wp:inline>
+        </w:drawing>
+      </w:r>
+    </w:p>
+    <w:p>
+      <w:pPr>
+        <w:rPr>
+          <w:rFonts w:ascii="Times New Roman" w:hAnsi="Times New Roman" w:cs="Times New Roman"/>
+        </w:rPr>
+      </w:pPr>
+      <w:r>
+        <w:rPr>
+          <w:rFonts w:ascii="Times New Roman" w:hAnsi="Times New Roman" w:cs="Times New Roman"/>
+        </w:rPr>
+        <w:t>Figure J is the first amplification stage, a programmable gain amplifier. For general operation, this is set to 2 V/V gain to step from the 2.5 V domain to the 5 V domain. It may also be set to 1 V/V for more fine grain tuning at smaller amplitudes. Output from this amplifier is fed to the adjustable resistor divider.</w:t>
+      </w:r>
+    </w:p>
+    <w:p>
+      <w:pPr>
+        <w:rPr>
+          <w:rFonts w:ascii="Times New Roman" w:hAnsi="Times New Roman" w:cs="Times New Roman"/>
+        </w:rPr>
+      </w:pPr>
+      <w:r>
+        <w:rPr>
+          <w:rFonts w:ascii="Times New Roman" w:hAnsi="Times New Roman" w:cs="Times New Roman"/>
+          <w:noProof/>
+        </w:rPr>
+        <w:drawing>
+          <wp:inline distT="0" distB="0" distL="0" distR="0" wp14:anchorId="3E27A235" wp14:editId="7B59BA44">
+            <wp:extent cx="5943600" cy="1771650"/>
+            <wp:effectExtent l="0" t="0" r="0" b="0"/>
+            <wp:docPr id="1460394144" name="Picture 24" descr="A diagram of a computer&#10;&#10;AI-generated content may be incorrect."/>
+            <wp:cNvGraphicFramePr>
+              <a:graphicFrameLocks xmlns:a="http://schemas.openxmlformats.org/drawingml/2006/main" noChangeAspect="1"/>
+            </wp:cNvGraphicFramePr>
+            <a:graphic xmlns:a="http://schemas.openxmlformats.org/drawingml/2006/main">
+              <a:graphicData uri="http://schemas.openxmlformats.org/drawingml/2006/picture">
+                <pic:pic xmlns:pic="http://schemas.openxmlformats.org/drawingml/2006/picture">
+                  <pic:nvPicPr>
+                    <pic:cNvPr id="1460394144" name="Picture 24" descr="A diagram of a computer&#10;&#10;AI-generated content may be incorrect."/>
+                    <pic:cNvPicPr/>
+                  </pic:nvPicPr>
+                  <pic:blipFill>
+                    <a:blip r:embed="rId14" cstate="print">
+                      <a:extLst>
+                        <a:ext uri="{28A0092B-C50C-407E-A947-70E740481C1C}">
+                          <a14:useLocalDpi xmlns:a14="http://schemas.microsoft.com/office/drawing/2010/main" val="0"/>
+                        </a:ext>
+                      </a:extLst>
+                    </a:blip>
+                    <a:stretch>
+                      <a:fillRect/>
+                    </a:stretch>
+                  </pic:blipFill>
+                  <pic:spPr>
+                    <a:xfrm>
+                      <a:off x="0" y="0"/>
+                      <a:ext cx="5943600" cy="1771650"/>
+                    </a:xfrm>
+                    <a:prstGeom prst="rect">
+                      <a:avLst/>
+                    </a:prstGeom>
+                  </pic:spPr>
+                </pic:pic>
+              </a:graphicData>
+            </a:graphic>
+          </wp:inline>
+        </w:drawing>
+      </w:r>
+    </w:p>
+    <w:p>
+      <w:pPr>
+        <w:rPr>
+          <w:rFonts w:ascii="Times New Roman" w:hAnsi="Times New Roman" w:cs="Times New Roman"/>
+        </w:rPr>
+      </w:pPr>
+      <w:r>
+        <w:rPr>
+          <w:rFonts w:ascii="Times New Roman" w:hAnsi="Times New Roman" w:cs="Times New Roman"/>
+        </w:rPr>
+        <w:t>Figure K shows the second amplification stage, an adjustable resistor divider. At startup the adjustable resistor to ground is set to nearly 0 ohms, so that even if the DDS produces output it is attenuated hard to nothing. Using the up/down interface, the resistance can be slowly increased by the MCU, so that the amplitude of the sine wave gradually increases and does not step up at startup. At maximum, the resistor divider multiplies the signal by one half. Not shown is the buffer after this resistor divider, which ensures later stages do not feed back into it and affect the math of the attenuation.</w:t>
+      </w:r>
+    </w:p>
+    <w:p>
+      <w:pPr>
+        <w:rPr>
+          <w:rFonts w:ascii="Times New Roman" w:hAnsi="Times New Roman" w:cs="Times New Roman"/>
+        </w:rPr>
+      </w:pPr>
+      <w:r>
+        <w:rPr>
+          <w:rFonts w:ascii="Times New Roman" w:hAnsi="Times New Roman" w:cs="Times New Roman"/>
+          <w:noProof/>
+        </w:rPr>
+        <w:lastRenderedPageBreak/>
+        <w:drawing>
+          <wp:inline distT="0" distB="0" distL="0" distR="0" wp14:anchorId="43D80EC9" wp14:editId="425CC0B5">
+            <wp:extent cx="5742168" cy="3475021"/>
+            <wp:effectExtent l="0" t="0" r="0" b="0"/>
+            <wp:docPr id="2114524494" name="Picture 25" descr="A diagram of a circuit&#10;&#10;AI-generated content may be incorrect."/>
+            <wp:cNvGraphicFramePr>
+              <a:graphicFrameLocks xmlns:a="http://schemas.openxmlformats.org/drawingml/2006/main" noChangeAspect="1"/>
+            </wp:cNvGraphicFramePr>
+            <a:graphic xmlns:a="http://schemas.openxmlformats.org/drawingml/2006/main">
+              <a:graphicData uri="http://schemas.openxmlformats.org/drawingml/2006/picture">
+                <pic:pic xmlns:pic="http://schemas.openxmlformats.org/drawingml/2006/picture">
+                  <pic:nvPicPr>
+                    <pic:cNvPr id="2114524494" name="Picture 25" descr="A diagram of a circuit&#10;&#10;AI-generated content may be incorrect."/>
+                    <pic:cNvPicPr/>
+                  </pic:nvPicPr>
+                  <pic:blipFill>
+                    <a:blip r:embed="rId15" cstate="print">
+                      <a:extLst>
+                        <a:ext uri="{28A0092B-C50C-407E-A947-70E740481C1C}">
+                          <a14:useLocalDpi xmlns:a14="http://schemas.microsoft.com/office/drawing/2010/main" val="0"/>
+                        </a:ext>
+                      </a:extLst>
+                    </a:blip>
+                    <a:stretch>
+                      <a:fillRect/>
+                    </a:stretch>
+                  </pic:blipFill>
+                  <pic:spPr>
+                    <a:xfrm>
+                      <a:off x="0" y="0"/>
+                      <a:ext cx="5742168" cy="3475021"/>
+                    </a:xfrm>
+                    <a:prstGeom prst="rect">
+                      <a:avLst/>
+                    </a:prstGeom>
+                  </pic:spPr>
+                </pic:pic>
+              </a:graphicData>
+            </a:graphic>
+          </wp:inline>
+        </w:drawing>
+      </w:r>
+    </w:p>
+    <w:p>
+      <w:pPr>
+        <w:rPr>
+          <w:rFonts w:ascii="Times New Roman" w:hAnsi="Times New Roman" w:cs="Times New Roman"/>
+        </w:rPr>
+      </w:pPr>
+      <w:r>
+        <w:rPr>
+          <w:rFonts w:ascii="Times New Roman" w:hAnsi="Times New Roman" w:cs="Times New Roman"/>
+        </w:rPr>
+        <w:t xml:space="preserve">Figure L shows another adjustable resistor divider for midpoint control, which will be explained later. This </w:t>
+      </w:r>
+      <w:r>
+        <w:rPr>
+          <w:rFonts w:ascii="Times New Roman" w:hAnsi="Times New Roman" w:cs="Times New Roman"/>
+        </w:rPr>
+        <w:t>should generally be set all the way down at startup and increased in equal increments to the amplification resistor divider. The components are selected such that if the resistance of the amplification divider and this one are equal, the output of the midpoint select will be the center of the sine wave being generated. This is important for the voltage-controlled current source.</w:t>
+      </w:r>
+    </w:p>
+    <w:p>
+      <w:pPr>
+        <w:rPr>
+          <w:rFonts w:ascii="Times New Roman" w:hAnsi="Times New Roman" w:cs="Times New Roman"/>
+        </w:rPr>
+      </w:pPr>
+      <w:r>
+        <w:rPr>
+          <w:rFonts w:ascii="Times New Roman" w:hAnsi="Times New Roman" w:cs="Times New Roman"/>
+          <w:noProof/>
+        </w:rPr>
+        <w:lastRenderedPageBreak/>
+        <w:drawing>
+          <wp:inline distT="0" distB="0" distL="0" distR="0" wp14:anchorId="6D9FD0E9" wp14:editId="3238A69E">
+            <wp:extent cx="5943600" cy="3802380"/>
+            <wp:effectExtent l="0" t="0" r="0" b="7620"/>
+            <wp:docPr id="800445737" name="Picture 26" descr="A diagram of a circuit&#10;&#10;AI-generated content may be incorrect."/>
+            <wp:cNvGraphicFramePr>
+              <a:graphicFrameLocks xmlns:a="http://schemas.openxmlformats.org/drawingml/2006/main" noChangeAspect="1"/>
+            </wp:cNvGraphicFramePr>
+            <a:graphic xmlns:a="http://schemas.openxmlformats.org/drawingml/2006/main">
+              <a:graphicData uri="http://schemas.openxmlformats.org/drawingml/2006/picture">
+                <pic:pic xmlns:pic="http://schemas.openxmlformats.org/drawingml/2006/picture">
+                  <pic:nvPicPr>
+                    <pic:cNvPr id="800445737" name="Picture 26" descr="A diagram of a circuit&#10;&#10;AI-generated content may be incorrect."/>
+                    <pic:cNvPicPr/>
+                  </pic:nvPicPr>
+                  <pic:blipFill>
+                    <a:blip r:embed="rId16" cstate="print">
+                      <a:extLst>
+                        <a:ext uri="{28A0092B-C50C-407E-A947-70E740481C1C}">
+                          <a14:useLocalDpi xmlns:a14="http://schemas.microsoft.com/office/drawing/2010/main" val="0"/>
+                        </a:ext>
+                      </a:extLst>
+                    </a:blip>
+                    <a:stretch>
+                      <a:fillRect/>
+                    </a:stretch>
+                  </pic:blipFill>
+                  <pic:spPr>
+                    <a:xfrm>
+                      <a:off x="0" y="0"/>
+                      <a:ext cx="5943600" cy="3802380"/>
+                    </a:xfrm>
+                    <a:prstGeom prst="rect">
+                      <a:avLst/>
+                    </a:prstGeom>
+                  </pic:spPr>
+                </pic:pic>
+              </a:graphicData>
+            </a:graphic>
+          </wp:inline>
+        </w:drawing>
+      </w:r>
+    </w:p>
+    <w:p>
+      <w:pPr>
+        <w:rPr>
+          <w:rFonts w:ascii="Times New Roman" w:hAnsi="Times New Roman" w:cs="Times New Roman"/>
+        </w:rPr>
+      </w:pPr>
+      <w:r>
+        <w:rPr>
+          <w:rFonts w:ascii="Times New Roman" w:hAnsi="Times New Roman" w:cs="Times New Roman"/>
+        </w:rPr>
+        <w:t>Figure M shows the final stage of the signal amplification, the conversion from voltage to current domain. By feeding two op-amps into each other, the voltage across R12 is precisely controlled and thus the output current. Because a positive and negative current waveform is desired but only a positive voltage domain sine wave is fed in, the midpoint of the signal is used to set the zero point of the output current. The output of the current source must be sunk to ground for the current to have a route to travel, and in this case, it is fed into the output transformer. The op-amps at this stage use the 30 V rails, which is the maximum allowable voltage that the device should generate. The equations governing operation of the current source are shown on the schematic.</w:t>
+      </w:r>
+    </w:p>
+    <w:p>
+      <w:pPr>
+        <w:rPr>
+          <w:rFonts w:ascii="Times New Roman" w:hAnsi="Times New Roman" w:cs="Times New Roman"/>
+        </w:rPr>
+      </w:pPr>
+      <w:r>
+        <w:rPr>
+          <w:rFonts w:ascii="Times New Roman" w:hAnsi="Times New Roman" w:cs="Times New Roman"/>
+          <w:noProof/>
+        </w:rPr>
+        <w:lastRenderedPageBreak/>
+        <w:drawing>
+          <wp:inline distT="0" distB="0" distL="0" distR="0" wp14:anchorId="3336BC15" wp14:editId="6BF08B90">
+            <wp:extent cx="3859320" cy="4358640"/>
+            <wp:effectExtent l="0" t="0" r="8255" b="3810"/>
+            <wp:docPr id="1564558261" name="Picture 27" descr="A circuit board with many small components&#10;&#10;AI-generated content may be incorrect."/>
+            <wp:cNvGraphicFramePr>
+              <a:graphicFrameLocks xmlns:a="http://schemas.openxmlformats.org/drawingml/2006/main" noChangeAspect="1"/>
+            </wp:cNvGraphicFramePr>
+            <a:graphic xmlns:a="http://schemas.openxmlformats.org/drawingml/2006/main">
+              <a:graphicData uri="http://schemas.openxmlformats.org/drawingml/2006/picture">
+                <pic:pic xmlns:pic="http://schemas.openxmlformats.org/drawingml/2006/picture">
+                  <pic:nvPicPr>
+                    <pic:cNvPr id="1564558261" name="Picture 27" descr="A circuit board with many small components&#10;&#10;AI-generated content may be incorrect."/>
+                    <pic:cNvPicPr/>
+                  </pic:nvPicPr>
+                  <pic:blipFill>
+                    <a:blip r:embed="rId17">
+                      <a:extLst>
+                        <a:ext uri="{28A0092B-C50C-407E-A947-70E740481C1C}">
+                          <a14:useLocalDpi xmlns:a14="http://schemas.microsoft.com/office/drawing/2010/main" val="0"/>
+                        </a:ext>
+                      </a:extLst>
+                    </a:blip>
+                    <a:stretch>
+                      <a:fillRect/>
+                    </a:stretch>
+                  </pic:blipFill>
+                  <pic:spPr>
+                    <a:xfrm>
+                      <a:off x="0" y="0"/>
+                      <a:ext cx="3860008" cy="4359417"/>
+                    </a:xfrm>
+                    <a:prstGeom prst="rect">
+                      <a:avLst/>
+                    </a:prstGeom>
+                  </pic:spPr>
+                </pic:pic>
+              </a:graphicData>
+            </a:graphic>
+          </wp:inline>
+        </w:drawing>
+      </w:r>
+    </w:p>
+    <w:p>
+      <w:pPr>
+        <w:rPr>
+          <w:rFonts w:ascii="Times New Roman" w:hAnsi="Times New Roman" w:cs="Times New Roman"/>
+        </w:rPr>
+      </w:pPr>
+      <w:r>
+        <w:rPr>
+          <w:rFonts w:ascii="Times New Roman" w:hAnsi="Times New Roman" w:cs="Times New Roman"/>
+        </w:rPr>
+        <w:t>Figure N shows the final assembled board. The housing is 3D printed to the dimensions of the board. Underneath the board is stored the rechargeable battery. On the right side are the output ports and soft kill button, and on the left side is the hard kill switch. The dimensions of the final assembly are roughly 3.5”x5.25”x1.5”, not including the output ports. The casing includes a top to completely hide the circuit board.</w:t>
       </w:r>
     </w:p>
     <w:sectPr>

</xml_diff>